<commit_message>
corectare suprascriere db cu date vechi peste cele noi, corectare cale semnatura tehnician 2
</commit_message>
<xml_diff>
--- a/dist/Gestiune_clienti_sqlite_portabil_v4/_internal/template/dosar_asistenta.docx
+++ b/dist/Gestiune_clienti_sqlite_portabil_v4/_internal/template/dosar_asistenta.docx
@@ -2796,18 +2796,12 @@
           <w:p>
             <w:pPr>
               <w:spacing w:after="0" w:line="240" w:lineRule="auto"/>
-              <w:rPr>
-                <w:sz w:val="18"/>
-                <w:szCs w:val="18"/>
-              </w:rPr>
-            </w:pPr>
-            <w:r>
-              <w:rPr>
-                <w:sz w:val="18"/>
-                <w:szCs w:val="18"/>
-              </w:rPr>
-              <w:t xml:space="preserve">          </w:t>
-            </w:r>
+              <w:jc w:val="center"/>
+              <w:rPr>
+                <w:sz w:val="18"/>
+                <w:szCs w:val="18"/>
+              </w:rPr>
+            </w:pPr>
             <w:r>
               <w:rPr>
                 <w:sz w:val="18"/>

</xml_diff>